<commit_message>
001-030: manbalar aniq hujjat nomlari bilan yangilandi (SanQvaM, qonun, Mirtazayev darsligi, JSST/CDC)
</commit_message>
<xml_diff>
--- a/javoblar/001.docx
+++ b/javoblar/001.docx
@@ -165,7 +165,7 @@
         <w:spacing w:after="40"/>
       </w:pPr>
       <w:r>
-        <w:t xml:space="preserve">Umumiy epidemiologiya. Oliy tibbiy ta'lim muassasalari uchun darslik. — Toshkent: Tibbiyot nashriyoti. (Gromashevskiy, Belyakov, Pavlovskiy nazariyalari bayon etilgan.)</w:t>
+        <w:t xml:space="preserve">Mirtazayev O.M., Zuyeva L.P., Matnazarova G.S. Epidemiologiya. — Toshkent, 2016.</w:t>
       </w:r>
     </w:p>
     <w:p>
@@ -178,7 +178,7 @@
         <w:spacing w:after="40"/>
       </w:pPr>
       <w:r>
-        <w:t xml:space="preserve">Epidemiologiya tarixiga oid xalqaro manbalar: Gippokrat, Ibn Sino, Jon Snou (1854, London vabosi) va Robert Koxning ishlari umumiy epidemiologiya darsliklarida keltirilgan.</w:t>
+        <w:t xml:space="preserve">Komilov X. Sanitariya-epidemiologiya xizmati qisqacha tarixi. — 2025 (ochiq manba). URL: https://xayrullokomilov.uz/kutubxona</w:t>
       </w:r>
     </w:p>
     <w:p>
@@ -191,7 +191,7 @@
         <w:spacing w:after="40"/>
       </w:pPr>
       <w:r>
-        <w:t xml:space="preserve">X. Komilov. Sanitariya-epidemiologiya xizmati qisqacha tarixi. — xayrullokomilov.uz kutubxonasi (ochiq manba). URL: https://xayrullokomilov.uz/kutubxona</w:t>
+        <w:t xml:space="preserve">Snow J. On the Mode of Communication of Cholera, 2nd ed., London, 1855 (epidemiologiya tarixi).</w:t>
       </w:r>
     </w:p>
     <w:sectPr>

</xml_diff>

<commit_message>
001-009 qayta yozildi, №3 qo'shildi, 010-050 raqamlari manbaga moslandi, ZIP va hisobot yangilandi
</commit_message>
<xml_diff>
--- a/javoblar/001.docx
+++ b/javoblar/001.docx
@@ -5,154 +5,110 @@
     <w:p>
       <w:pPr>
         <w:pStyle w:val="Heading1"/>
-        <w:spacing w:after="200"/>
-      </w:pPr>
-      <w:r>
+        <w:spacing w:after="240"/>
+        <w:jc w:val="center"/>
+      </w:pPr>
+      <w:r>
+        <w:rPr>
+          <w:rFonts w:ascii="Times New Roman" w:cs="Times New Roman" w:eastAsia="Times New Roman" w:hAnsi="Times New Roman"/>
+          <w:b/>
+          <w:bCs/>
+          <w:sz w:val="28"/>
+          <w:szCs w:val="28"/>
+        </w:rPr>
         <w:t xml:space="preserve">1. Epidemiologiya so'zining ta'rifi. Epidemiologiya fanining rivojlanish tarixi</w:t>
       </w:r>
     </w:p>
     <w:p>
       <w:pPr>
-        <w:spacing w:after="120"/>
-        <w:jc w:val="both"/>
-      </w:pPr>
-      <w:r>
-        <w:t xml:space="preserve">Epidemiologiya — aholi orasida kasalliklarning paydo bo'lishi va tarqalishi qonuniyatlarini, ularni keltirib chiqaruvchi omillarni hamda shu asosda kasalliklarning oldini olish va ularga qarshi kurash choralarini ishlab chiqishni o'rganuvchi tibbiy fandir. "Epidemiologiya" atamasi yunoncha uchta so'zdan tashkil topgan: epi — "orasida, ustida", demos — "xalq, aholi", logos — "ta'limot, fan". Shunday qilib, so'zma-so'z tarjimada bu "aholi orasida kechadigan hodisalar haqidagi fan" degan ma'noni bildiradi. Zamonaviy talqinda epidemiologiya nafaqat yuqumli, balki yuqumsiz kasalliklarning ham populyatsiya darajasidagi taqsimotini o'rganadi va jamoat salomatligining nazariy poydevori hisoblanadi [1].</w:t>
-      </w:r>
-    </w:p>
-    <w:p>
-      <w:pPr>
         <w:pStyle w:val="Heading2"/>
-        <w:spacing w:after="80" w:before="160"/>
-      </w:pPr>
-      <w:r>
-        <w:t xml:space="preserve">Fanning predmeti va asosiy tushunchalari</w:t>
-      </w:r>
-    </w:p>
-    <w:p>
-      <w:pPr>
-        <w:spacing w:after="120"/>
-        <w:jc w:val="both"/>
-      </w:pPr>
-      <w:r>
-        <w:t xml:space="preserve">Epidemiologiyaning o'rganish obyekti — epidemik jarayon, ya'ni aholi orasida yuqumli kasalliklarning uzluksiz paydo bo'lishi va tarqalishidir. Fan kasallikning vaqt, hudud va aholi guruhlari bo'yicha taqsimotini — ya'ni kim, qayerda va qachon kasallanishini — tahlil qiladi hamda bu taqsimotni belgilovchi sabab-oqibat bog'lanishlarini aniqlaydi. Natijada olingan bilimlar profilaktik va epidemiyaga qarshi tadbirlarni ilmiy asoslash uchun ishlatiladi. Epidemiologik tadqiqot kasallanish, o'lim, zararlanish va letallik kabi ko'rsatkichlarni sonli (miqdoriy) baholashga tayanadi; shu bois epidemiologiyani ko'pincha jamoat salomatligining "diagnostik usuli" deb ham ataydilar. Fanning uchta asosiy vazifasi: kasallanish holatini tavsiflash, sabablarni (xavf omillarini) aniqlash va o'tkazilayotgan tadbirlar samaradorligini baholashdir. Epidemiologiya umumiy (nazariy) va xususiy (ayrim kasalliklar epidemiologiyasi) qismlarga bo'linadi; shuningdek, harbiy, gospital (shifoxona ichi infeksiyalari) va yuqumsiz kasalliklar epidemiologiyasi kabi yo'nalishlarga ajraladi. Bu bo'linish fanning keng qamrovli amaliy ahamiyatini ko'rsatadi [1].</w:t>
+        <w:spacing w:after="100" w:before="200"/>
+      </w:pPr>
+      <w:r>
+        <w:rPr>
+          <w:rFonts w:ascii="Times New Roman" w:cs="Times New Roman" w:eastAsia="Times New Roman" w:hAnsi="Times New Roman"/>
+          <w:b/>
+          <w:bCs/>
+          <w:sz w:val="28"/>
+          <w:szCs w:val="28"/>
+        </w:rPr>
+        <w:t xml:space="preserve">Kirish</w:t>
+      </w:r>
+    </w:p>
+    <w:p>
+      <w:pPr>
+        <w:spacing w:after="120" w:line="276"/>
+        <w:ind w:firstLine="567"/>
+        <w:jc w:val="both"/>
+      </w:pPr>
+      <w:r>
+        <w:rPr>
+          <w:rFonts w:ascii="Times New Roman" w:cs="Times New Roman" w:eastAsia="Times New Roman" w:hAnsi="Times New Roman"/>
+          <w:sz w:val="28"/>
+          <w:szCs w:val="28"/>
+        </w:rPr>
+        <w:t xml:space="preserve">Epidemiologiya jamoat salomatligining asosiy fani hisoblanadi: u kasalliklarning aholi orasida qanday tarqalishini va nima sababdan tarqalishini o'rganadi hamda bu bilimni kasalliklarni nazorat qilishda qo'llaydi [2]. Tibbiyot oliygohida epidemiologiyani o'rganish uchun uning ta'rifini, tarixiy bosqichlarini va O'zbekistondagi rivojlanish yo'lini bilish zarur.</w:t>
       </w:r>
     </w:p>
     <w:p>
       <w:pPr>
         <w:pStyle w:val="Heading2"/>
-        <w:spacing w:after="80" w:before="160"/>
-      </w:pPr>
-      <w:r>
-        <w:t xml:space="preserve">Fanning rivojlanish tarixi</w:t>
-      </w:r>
-    </w:p>
-    <w:p>
-      <w:pPr>
-        <w:spacing w:after="120"/>
-        <w:jc w:val="both"/>
-      </w:pPr>
-      <w:r>
-        <w:t xml:space="preserve">Epidemiologik tafakkurning ildizlari qadimgi davrlarga borib taqaladi. Antik davr tabibi Gippokrat (eramizdan avvalgi V–IV asrlar) o'zining "Havo, suv va joylar haqida" asarida kasalliklarning kelib chiqishini atrof-muhit, iqlim va turmush sharoiti bilan bog'lagan va shu bilan kasalliklarga ekologik yondashuvning asosini qo'ygan. O'rta asrlarda buyuk alloma Ibn Sino (Avitsenna) "Tib qonunlari" asarida yuqumli kasalliklar ko'zga ko'rinmas mayda zarralar orqali yuqishi mumkinligi haqidagi fikrni ilgari surgan va bemorlarni ajratish, ya'ni karantin g'oyasiga yaqin tasavvurlarni bayon etgan. Bu qarashlar infeksiyaning yuqishi haqidagi keyingi ilmiy tasavvurlar uchun zamin bo'ldi [2].</w:t>
-      </w:r>
-    </w:p>
-    <w:p>
-      <w:pPr>
-        <w:spacing w:after="120"/>
-        <w:jc w:val="both"/>
-      </w:pPr>
-      <w:r>
-        <w:t xml:space="preserve">Fanning empirik bosqichi XIX asrda boshlangan. Ingliz shifokori Jon Snou (John Snow) 1854-yilda Londondagi vabo epidemiyasini o'rganib, kasallanish holatlarini shahar xaritasiga tushirdi va infeksiya manbasini Brod-strit (Broad Street) ko'chasidagi suv nasosi bilan bog'ladi. Nasos dastasini olib tashlash orqali epidemiya to'xtatildi. Bu tadqiqot qo'zg'atuvchi hali kashf etilmasdan turib, faqat epidemiologik kuzatuv va tahlil orqali yuqish yo'lini aniqlash va to'xtatish mumkinligini ko'rsatdi; shu sababli u zamonaviy dala epidemiologiyasining klassik namunasi hisoblanadi [2].</w:t>
-      </w:r>
-    </w:p>
-    <w:p>
-      <w:pPr>
-        <w:spacing w:after="120"/>
-        <w:jc w:val="both"/>
-      </w:pPr>
-      <w:r>
-        <w:t xml:space="preserve">XIX asr oxiri — XX asr boshida mikrobiologiyaning jadal rivojlanishi epidemiologiyani sifat jihatdan yangi bosqichga olib chiqdi. Lui Paster yuqtirilgan immunitet va vaksinatsiya tamoyillarini asosladi, Robert Kox esa kasallik qo'zg'atuvchisi bilan kasallik o'rtasidagi sabab-oqibat bog'lanishini isbotlash mezonlarini — Kox postulatlarini — ishlab chiqdi. Bu kashfiyotlar epidemik jarayonning birinchi bo'g'ini bo'lmish infeksiya manbaini ilmiy aniqlash va qo'zg'atuvchini identifikatsiya qilish imkonini berdi, natijada profilaktika aniq biologik asosga ega bo'ldi [1].</w:t>
-      </w:r>
-    </w:p>
-    <w:p>
-      <w:pPr>
-        <w:pStyle w:val="Heading2"/>
-        <w:spacing w:after="80" w:before="160"/>
-      </w:pPr>
-      <w:r>
-        <w:t xml:space="preserve">Mamlakatimizda va MDHda rivojlanishi</w:t>
-      </w:r>
-    </w:p>
-    <w:p>
-      <w:pPr>
-        <w:spacing w:after="120"/>
-        <w:jc w:val="both"/>
-      </w:pPr>
-      <w:r>
-        <w:t xml:space="preserve">Sobiq ittifoq va MDH mamlakatlarida epidemiologiya alohida mukammal nazariy fan sifatida shakllandi. L.V. Gromashevskiy yuqish mexanizmi haqidagi ta'limotni va kasalliklarning yuqish mexanizmiga asoslangan tasnifini yaratdi — bu tasnif bugungi kungacha amaliyotda qo'llaniladi. V.D. Belyakov epidemik jarayonning o'z-o'zini boshqarish (samoregulyatsiya) nazariyasini ishlab chiqdi, Y.N. Pavlovskiy esa tabiiy o'choqlilik ta'limotini asoslab, bir qator transmissiv kasalliklarning tabiatdagi aylanishini tushuntirdi. Bu nazariyalar profilaktik ishning ilmiy poydevori bo'lib xizmat qilmoqda [1]. O'zbekistonda sanitariya-epidemiologiya xizmati o'tgan asrning boshlaridan tashkil etilib, keng tarqalgan yuqumli kasalliklarga — bezgak, ich terlama, traxoma, o'lat kabilarga — qarshi kurashda hal qiluvchi rol o'ynadi [3].</w:t>
-      </w:r>
-    </w:p>
-    <w:p>
-      <w:pPr>
-        <w:pStyle w:val="Heading2"/>
-        <w:spacing w:after="80" w:before="160"/>
-      </w:pPr>
-      <w:r>
-        <w:t xml:space="preserve">Zamonaviy epidemiologiya</w:t>
-      </w:r>
-    </w:p>
-    <w:p>
-      <w:pPr>
-        <w:spacing w:after="120"/>
-        <w:jc w:val="both"/>
-      </w:pPr>
-      <w:r>
-        <w:t xml:space="preserve">XX asrning ikkinchi yarmidan boshlab epidemiologiya o'z doirasini kengaytirib, yuqumsiz kasalliklarni — yurak-qon tomir kasalliklari, o'smalar, qandli diabet va shikastlanishlarni ham o'z ichiga oldi. Richard Doll va Ostin Bredford Hill tomonidan o'tkazilgan chekish va o'pka saratoni o'rtasidagi bog'liqlikni ko'rsatuvchi uzoq muddatli kogort tadqiqoti analitik epidemiologiyaning kuchli imkoniyatlarini namoyish etdi va xavf omillarini aniqlashning namunasi bo'ldi. Bugungi kunda epidemiologiya dalillarga asoslangan tibbiyot (evidence-based medicine), jamoat salomatligi monitoringi, immunprofilaktika dasturlari va pandemiyalarga tayyorgarlik tizimining asosida yotadi. 2020-yildagi COVID-19 pandemiyasi esa fanning global ahamiyatini, modellashtirish va tezkor nazoratning rolini yana bir bor yaqqol tasdiqladi [1].</w:t>
-      </w:r>
-    </w:p>
-    <w:p>
-      <w:pPr>
-        <w:pStyle w:val="Heading2"/>
-        <w:spacing w:after="80" w:before="160"/>
-      </w:pPr>
-      <w:r>
-        <w:t xml:space="preserve">Epidemiologik usulning mohiyati</w:t>
-      </w:r>
-    </w:p>
-    <w:p>
-      <w:pPr>
-        <w:spacing w:after="120"/>
-        <w:jc w:val="both"/>
-      </w:pPr>
-      <w:r>
-        <w:t xml:space="preserve">Epidemiologiyaning o'ziga xosligi uning tadqiqot usulida namoyon bo'ladi. Klinik tibbiyot alohida bemorni o'rgansa, epidemiologiya butun populyatsiyani (jamoani) birlik sifatida tahlil qiladi. Epidemiologik usul tavsifiy (deskriptiv) va tahliliy (analitik) yondashuvlarni, statistik va mantiqiy tahlilni hamda qiyoslash prinsipini o'z ichiga oladi. Kasallanish darajasini guruhlar bo'yicha taqqoslash orqali xavf omillari aniqlanadi; keyin esa gipotezalar maxsus tashkil etilgan tadqiqotlar (kogort, nazorat-tanlov) yordamida tekshiriladi. Shu tariqa epidemiologiya kasallikning "nima uchun aynan shu yerda va shu guruhda" ko'proq uchrashini izohlaydi va oqilona profilaktik qaror qabul qilish uchun asos yaratadi [1].</w:t>
-      </w:r>
-    </w:p>
-    <w:p>
-      <w:pPr>
-        <w:pStyle w:val="Heading2"/>
-        <w:spacing w:after="80" w:before="160"/>
-      </w:pPr>
-      <w:r>
-        <w:t xml:space="preserve">Xulosa</w:t>
-      </w:r>
-    </w:p>
-    <w:p>
-      <w:pPr>
-        <w:spacing w:after="120"/>
-        <w:jc w:val="both"/>
-      </w:pPr>
-      <w:r>
-        <w:t xml:space="preserve">Epidemiologiya — kasalliklarning populyatsiya darajasidagi taqsimoti va sabablarini o'rganuvchi fan bo'lib, Gippokratning kuzatuvlaridan boshlanib, Ibn Sinoning yuqish haqidagi tasavvurlari, Jon Snouning dala tadqiqoti, mikrobiologiya kashfiyotlari hamda Gromashevskiy va Belyakov nazariyalari orqali mukammal ilmiy tizimga aylandi. Uning asosiy maqsadi — kasalliklarning tarqalish qonuniyatlarini bilish asosida profilaktika va epidemiyaga qarshi kurash tadbirlarini ilmiy asoslashdir. Fanning tarixiy taraqqiyoti amaliy jamoat salomatligi bilan uzviy bog'liq bo'lib kelgan va bu bog'liqlik zamonaviy sharoitda — immunprofilaktika, epidemiologik nazorat va pandemiyalarga tayyorgarlik vazifalari oldida — yanada mustahkamlanmoqda. Bo'lajak epidemiolog uchun fanning tarixini bilish uning mantiqiy asoslarini va zamonaviy usullarining kelib chiqishini chuqur anglash imkonini beradi.</w:t>
-      </w:r>
-    </w:p>
-    <w:p>
-      <w:pPr>
-        <w:pStyle w:val="Heading2"/>
-        <w:spacing w:after="80" w:before="220"/>
-      </w:pPr>
-      <w:r>
-        <w:t xml:space="preserve">Foydalanilgan adabiyotlar</w:t>
+        <w:spacing w:after="100" w:before="200"/>
+      </w:pPr>
+      <w:r>
+        <w:rPr>
+          <w:rFonts w:ascii="Times New Roman" w:cs="Times New Roman" w:eastAsia="Times New Roman" w:hAnsi="Times New Roman"/>
+          <w:b/>
+          <w:bCs/>
+          <w:sz w:val="28"/>
+          <w:szCs w:val="28"/>
+        </w:rPr>
+        <w:t xml:space="preserve">Epidemiologiyaning ta'rifi</w:t>
+      </w:r>
+    </w:p>
+    <w:p>
+      <w:pPr>
+        <w:spacing w:after="120" w:line="276"/>
+        <w:ind w:firstLine="567"/>
+        <w:jc w:val="both"/>
+      </w:pPr>
+      <w:r>
+        <w:rPr>
+          <w:rFonts w:ascii="Times New Roman" w:cs="Times New Roman" w:eastAsia="Times New Roman" w:hAnsi="Times New Roman"/>
+          <w:sz w:val="28"/>
+          <w:szCs w:val="28"/>
+        </w:rPr>
+        <w:t xml:space="preserve">"Epidemiologiya" atamasi yunoncha epi (ustida, orasida), demos (xalq) va logos (fan) so'zlaridan olingan bo'lib, xalq orasida tarqalgan hodisalarni o'rganuvchi fanni bildiradi [1]. O'zbek tilidagi darslikda epidemiologiya "kishilar o'rtasida har qanday patologik holatlar (kasalliklar) paydo bo'lish va tarqalish qonuniyatlarini o'rganadigan va ularga qarshi kurashish hamda ularning oldini olish chora-tadbirlarini ishlab chiqadigan fan" sifatida ta'riflanadi [1]. Xalqaro amaliyotda qabul qilingan ta'rif quyidagicha: epidemiologiya belgilangan aholi guruhlarida sog'liqqa oid holat yoki hodisalarning tarqalishi va determinantlarini o'rganish hamda bu bilimni sog'liq muammolarini nazorat qilishda qo'llashdir [2]. Ikkala ta'rifda ham fanning uch vazifasi ko'rinadi: tarqalishni tavsiflash, sabablarni aniqlash va chora ishlab chiqish.</w:t>
+      </w:r>
+    </w:p>
+    <w:p>
+      <w:pPr>
+        <w:spacing w:after="120" w:line="276"/>
+        <w:ind w:firstLine="567"/>
+        <w:jc w:val="both"/>
+      </w:pPr>
+      <w:r>
+        <w:rPr>
+          <w:rFonts w:ascii="Times New Roman" w:cs="Times New Roman" w:eastAsia="Times New Roman" w:hAnsi="Times New Roman"/>
+          <w:sz w:val="28"/>
+          <w:szCs w:val="28"/>
+        </w:rPr>
+        <w:t xml:space="preserve">Tarqalish ko'rsatkichi faqat holatlar sonini emas, balki ularning aholi soniga nisbatini ham anglatadi; hodisalar vaqt, joy va shaxs bo'yicha tavsiflanadi, bu esa tavsifiy epidemiologiyaning asosini tashkil etadi [2].</w:t>
+      </w:r>
+    </w:p>
+    <w:p>
+      <w:pPr>
+        <w:spacing w:after="120" w:line="276"/>
+        <w:ind w:firstLine="567"/>
+        <w:jc w:val="both"/>
+      </w:pPr>
+      <w:r>
+        <w:rPr>
+          <w:rFonts w:ascii="Times New Roman" w:cs="Times New Roman" w:eastAsia="Times New Roman" w:hAnsi="Times New Roman"/>
+          <w:sz w:val="28"/>
+          <w:szCs w:val="28"/>
+        </w:rPr>
+        <w:t xml:space="preserve">Ta'rifdagi asosiy tushunchalar quyidagicha izohlanadi [2]:</w:t>
       </w:r>
     </w:p>
     <w:p>
@@ -162,10 +118,16 @@
           <w:ilvl w:val="0"/>
           <w:numId w:val="2"/>
         </w:numPr>
-        <w:spacing w:after="40"/>
-      </w:pPr>
-      <w:r>
-        <w:t xml:space="preserve">Mirtazayev O.M., Zuyeva L.P., Matnazarova G.S. Epidemiologiya. — Toshkent, 2016.</w:t>
+        <w:spacing w:after="60" w:line="276"/>
+        <w:jc w:val="both"/>
+      </w:pPr>
+      <w:r>
+        <w:rPr>
+          <w:rFonts w:ascii="Times New Roman" w:cs="Times New Roman" w:eastAsia="Times New Roman" w:hAnsi="Times New Roman"/>
+          <w:sz w:val="28"/>
+          <w:szCs w:val="28"/>
+        </w:rPr>
+        <w:t xml:space="preserve">o'rganish (study) — epidemiologiya tizimli va xolis ma'lumot yig'ish, tahlil qilish va sharhlashga asoslangan ilmiy fan;</w:t>
       </w:r>
     </w:p>
     <w:p>
@@ -175,10 +137,16 @@
           <w:ilvl w:val="0"/>
           <w:numId w:val="2"/>
         </w:numPr>
-        <w:spacing w:after="40"/>
-      </w:pPr>
-      <w:r>
-        <w:t xml:space="preserve">Komilov X. Sanitariya-epidemiologiya xizmati qisqacha tarixi. — 2025 (ochiq manba). URL: https://xayrullokomilov.uz/kutubxona</w:t>
+        <w:spacing w:after="60" w:line="276"/>
+        <w:jc w:val="both"/>
+      </w:pPr>
+      <w:r>
+        <w:rPr>
+          <w:rFonts w:ascii="Times New Roman" w:cs="Times New Roman" w:eastAsia="Times New Roman" w:hAnsi="Times New Roman"/>
+          <w:sz w:val="28"/>
+          <w:szCs w:val="28"/>
+        </w:rPr>
+        <w:t xml:space="preserve">tarqalish (distribution) — sog'liq hodisalarining chastotasi va vaqt, joy hamda shaxs bo'yicha tuzilishi;</w:t>
       </w:r>
     </w:p>
     <w:p>
@@ -188,15 +156,420 @@
           <w:ilvl w:val="0"/>
           <w:numId w:val="2"/>
         </w:numPr>
-        <w:spacing w:after="40"/>
-      </w:pPr>
-      <w:r>
-        <w:t xml:space="preserve">Snow J. On the Mode of Communication of Cholera, 2nd ed., London, 1855 (epidemiologiya tarixi).</w:t>
+        <w:spacing w:after="60" w:line="276"/>
+        <w:jc w:val="both"/>
+      </w:pPr>
+      <w:r>
+        <w:rPr>
+          <w:rFonts w:ascii="Times New Roman" w:cs="Times New Roman" w:eastAsia="Times New Roman" w:hAnsi="Times New Roman"/>
+          <w:sz w:val="28"/>
+          <w:szCs w:val="28"/>
+        </w:rPr>
+        <w:t xml:space="preserve">determinantlar — kasallik paydo bo'lishiga ta'sir qiluvchi sabablar va xavf omillari;</w:t>
+      </w:r>
+    </w:p>
+    <w:p>
+      <w:pPr>
+        <w:pStyle w:val="ListParagraph"/>
+        <w:numPr>
+          <w:ilvl w:val="0"/>
+          <w:numId w:val="2"/>
+        </w:numPr>
+        <w:spacing w:after="60" w:line="276"/>
+        <w:jc w:val="both"/>
+      </w:pPr>
+      <w:r>
+        <w:rPr>
+          <w:rFonts w:ascii="Times New Roman" w:cs="Times New Roman" w:eastAsia="Times New Roman" w:hAnsi="Times New Roman"/>
+          <w:sz w:val="28"/>
+          <w:szCs w:val="28"/>
+        </w:rPr>
+        <w:t xml:space="preserve">qo'llash — natijalarni amaliy jamoat salomatligi choralariga aylantirish.</w:t>
+      </w:r>
+    </w:p>
+    <w:p>
+      <w:pPr>
+        <w:pStyle w:val="Heading2"/>
+        <w:spacing w:after="100" w:before="200"/>
+      </w:pPr>
+      <w:r>
+        <w:rPr>
+          <w:rFonts w:ascii="Times New Roman" w:cs="Times New Roman" w:eastAsia="Times New Roman" w:hAnsi="Times New Roman"/>
+          <w:b/>
+          <w:bCs/>
+          <w:sz w:val="28"/>
+          <w:szCs w:val="28"/>
+        </w:rPr>
+        <w:t xml:space="preserve">Qadimgi davr va o'rta asrlar</w:t>
+      </w:r>
+    </w:p>
+    <w:p>
+      <w:pPr>
+        <w:spacing w:after="120" w:line="276"/>
+        <w:ind w:firstLine="567"/>
+        <w:jc w:val="both"/>
+      </w:pPr>
+      <w:r>
+        <w:rPr>
+          <w:rFonts w:ascii="Times New Roman" w:cs="Times New Roman" w:eastAsia="Times New Roman" w:hAnsi="Times New Roman"/>
+          <w:sz w:val="28"/>
+          <w:szCs w:val="28"/>
+        </w:rPr>
+        <w:t xml:space="preserve">Epidemiologiya ildizlari taxminan 2500 yil oldinga, eramizdan avvalgi 400-yillar atrofiga borib taqaladi: Gippokrat kasallik paydo bo'lishini g'ayritabiiy kuchlar bilan emas, ratsional tarzda tushuntirishga urindi va "Havo, suvlar va joylar haqida" asarida atrof-muhit hamda xulq-atvor omillarining ahamiyatini ta'kidladi [3]. O'zbekcha darslikda Gippokrat fanning asoschisi sifatida ko'rsatilib, uning "Epidemiyalar to'g'risida yetti kitob" asari bizgacha yetib kelgani aytiladi [1].</w:t>
+      </w:r>
+    </w:p>
+    <w:p>
+      <w:pPr>
+        <w:spacing w:after="120" w:line="276"/>
+        <w:ind w:firstLine="567"/>
+        <w:jc w:val="both"/>
+      </w:pPr>
+      <w:r>
+        <w:rPr>
+          <w:rFonts w:ascii="Times New Roman" w:cs="Times New Roman" w:eastAsia="Times New Roman" w:hAnsi="Times New Roman"/>
+          <w:sz w:val="28"/>
+          <w:szCs w:val="28"/>
+        </w:rPr>
+        <w:t xml:space="preserve">Qadimdan epidemiyalar kelib chiqishi haqida ikki faraz mavjud bo'lgan. Miazma farazi bo'yicha kasallik tuproq, botqoq yoki havodagi sababchi moddalar orqali paydo bo'ladi; kontagioz farazi bo'yicha esa kasallik bemordan sog'lomga yuqadi [1]. Uyg'onish davrida italyan shifokori Frakastoro (1478–1553) kontagiozlik g'oyasini rivojlantirdi, D.S. Samoylovich (1724–1810) esa vabo qo'zg'atuvchisini aniqlash uchun mikroskopdan foydalanishga urindi, biroq u davrdagi texnika natija bermadi [1].</w:t>
+      </w:r>
+    </w:p>
+    <w:p>
+      <w:pPr>
+        <w:pStyle w:val="Heading2"/>
+        <w:spacing w:after="100" w:before="200"/>
+      </w:pPr>
+      <w:r>
+        <w:rPr>
+          <w:rFonts w:ascii="Times New Roman" w:cs="Times New Roman" w:eastAsia="Times New Roman" w:hAnsi="Times New Roman"/>
+          <w:b/>
+          <w:bCs/>
+          <w:sz w:val="28"/>
+          <w:szCs w:val="28"/>
+        </w:rPr>
+        <w:t xml:space="preserve">Statistik va mikrobiologik bosqich</w:t>
+      </w:r>
+    </w:p>
+    <w:p>
+      <w:pPr>
+        <w:spacing w:after="120" w:line="276"/>
+        <w:ind w:firstLine="567"/>
+        <w:jc w:val="both"/>
+      </w:pPr>
+      <w:r>
+        <w:rPr>
+          <w:rFonts w:ascii="Times New Roman" w:cs="Times New Roman" w:eastAsia="Times New Roman" w:hAnsi="Times New Roman"/>
+          <w:sz w:val="28"/>
+          <w:szCs w:val="28"/>
+        </w:rPr>
+        <w:t xml:space="preserve">Epidemiologik tafakkurning rivojida quyidagi bosqichlar muhim ahamiyatga ega bo'ldi [3]:</w:t>
+      </w:r>
+    </w:p>
+    <w:p>
+      <w:pPr>
+        <w:pStyle w:val="ListParagraph"/>
+        <w:numPr>
+          <w:ilvl w:val="0"/>
+          <w:numId w:val="3"/>
+        </w:numPr>
+        <w:spacing w:after="60" w:line="276"/>
+        <w:jc w:val="both"/>
+      </w:pPr>
+      <w:r>
+        <w:rPr>
+          <w:rFonts w:ascii="Times New Roman" w:cs="Times New Roman" w:eastAsia="Times New Roman" w:hAnsi="Times New Roman"/>
+          <w:sz w:val="28"/>
+          <w:szCs w:val="28"/>
+        </w:rPr>
+        <w:t xml:space="preserve">1662-yil: Jon Graunt London o'lim ko'rsatkichlarini tahlil qilib, o'lim va kasallanishning jinsga, shahar va qishloqqa hamda mavsumga bog'liq farqlarini birinchi bo'lib miqdoriy tavsifladi [3].</w:t>
+      </w:r>
+    </w:p>
+    <w:p>
+      <w:pPr>
+        <w:pStyle w:val="ListParagraph"/>
+        <w:numPr>
+          <w:ilvl w:val="0"/>
+          <w:numId w:val="3"/>
+        </w:numPr>
+        <w:spacing w:after="60" w:line="276"/>
+        <w:jc w:val="both"/>
+      </w:pPr>
+      <w:r>
+        <w:rPr>
+          <w:rFonts w:ascii="Times New Roman" w:cs="Times New Roman" w:eastAsia="Times New Roman" w:hAnsi="Times New Roman"/>
+          <w:sz w:val="28"/>
+          <w:szCs w:val="28"/>
+        </w:rPr>
+        <w:t xml:space="preserve">XIX asr boshi: Uilyam Farr Buyuk Britaniyada o'lim statistikasini tizimli to'plab, kasalliklar tasnifi va nazorat amaliyotining asoslarini yaratdi [3].</w:t>
+      </w:r>
+    </w:p>
+    <w:p>
+      <w:pPr>
+        <w:pStyle w:val="ListParagraph"/>
+        <w:numPr>
+          <w:ilvl w:val="0"/>
+          <w:numId w:val="3"/>
+        </w:numPr>
+        <w:spacing w:after="60" w:line="276"/>
+        <w:jc w:val="both"/>
+      </w:pPr>
+      <w:r>
+        <w:rPr>
+          <w:rFonts w:ascii="Times New Roman" w:cs="Times New Roman" w:eastAsia="Times New Roman" w:hAnsi="Times New Roman"/>
+          <w:sz w:val="28"/>
+          <w:szCs w:val="28"/>
+        </w:rPr>
+        <w:t xml:space="preserve">1854-yil: Jon Snou London Golden Square hududidagi vabo epidemiyasida bemorlar yashagan uylarni xaritaga tushirib, Broad Street quduq suvini asosiy manba deb aniqladi; quduq dastagi olib tashlangach, epidemiya to'xtadi [3].</w:t>
+      </w:r>
+    </w:p>
+    <w:p>
+      <w:pPr>
+        <w:pStyle w:val="ListParagraph"/>
+        <w:numPr>
+          <w:ilvl w:val="0"/>
+          <w:numId w:val="3"/>
+        </w:numPr>
+        <w:spacing w:after="60" w:line="276"/>
+        <w:jc w:val="both"/>
+      </w:pPr>
+      <w:r>
+        <w:rPr>
+          <w:rFonts w:ascii="Times New Roman" w:cs="Times New Roman" w:eastAsia="Times New Roman" w:hAnsi="Times New Roman"/>
+          <w:sz w:val="28"/>
+          <w:szCs w:val="28"/>
+        </w:rPr>
+        <w:t xml:space="preserve">Snou suv ta'minoti kompaniyalari xizmat ko'rsatgan tumanlarni taqqosladi: Southwark and Vauxhall kompaniyasi ta'minlagan tumanlarda vabodan o'lim har 1000 aholiga 5,0, Lambeth kompaniyasi ta'minlagan tumanlarda 0,9 ni tashkil etdi [3].</w:t>
+      </w:r>
+    </w:p>
+    <w:p>
+      <w:pPr>
+        <w:pStyle w:val="ListParagraph"/>
+        <w:numPr>
+          <w:ilvl w:val="0"/>
+          <w:numId w:val="3"/>
+        </w:numPr>
+        <w:spacing w:after="60" w:line="276"/>
+        <w:jc w:val="both"/>
+      </w:pPr>
+      <w:r>
+        <w:rPr>
+          <w:rFonts w:ascii="Times New Roman" w:cs="Times New Roman" w:eastAsia="Times New Roman" w:hAnsi="Times New Roman"/>
+          <w:sz w:val="28"/>
+          <w:szCs w:val="28"/>
+        </w:rPr>
+        <w:t xml:space="preserve">XIX asrning ikkinchi yarmi: Levenguk, Paster va Koch tadqiqotlari kontagiozlik farazining g'alabasini ta'minlab, kasalliklarning zamonaviy tashxisi, dezinfeksiya hamda vaksina va zardoblar yordamida maxsus profilaktikani joriy etishga olib keldi [1].</w:t>
+      </w:r>
+    </w:p>
+    <w:p>
+      <w:pPr>
+        <w:spacing w:after="120" w:line="276"/>
+        <w:ind w:firstLine="567"/>
+        <w:jc w:val="both"/>
+      </w:pPr>
+      <w:r>
+        <w:rPr>
+          <w:rFonts w:ascii="Times New Roman" w:cs="Times New Roman" w:eastAsia="Times New Roman" w:hAnsi="Times New Roman"/>
+          <w:sz w:val="28"/>
+          <w:szCs w:val="28"/>
+        </w:rPr>
+        <w:t xml:space="preserve">Muhimi shundaki, Snou mikroorganizmlar mavjudligini bilmagan holda ham epidemiologik tadqiqot orqali suv vabo tarqatuvchi omil ekanini isbotladi [3].</w:t>
+      </w:r>
+    </w:p>
+    <w:p>
+      <w:pPr>
+        <w:pStyle w:val="Heading2"/>
+        <w:spacing w:after="100" w:before="200"/>
+      </w:pPr>
+      <w:r>
+        <w:rPr>
+          <w:rFonts w:ascii="Times New Roman" w:cs="Times New Roman" w:eastAsia="Times New Roman" w:hAnsi="Times New Roman"/>
+          <w:b/>
+          <w:bCs/>
+          <w:sz w:val="28"/>
+          <w:szCs w:val="28"/>
+        </w:rPr>
+        <w:t xml:space="preserve">XX asr va O'zbekistondagi rivojlanish</w:t>
+      </w:r>
+    </w:p>
+    <w:p>
+      <w:pPr>
+        <w:spacing w:after="120" w:line="276"/>
+        <w:ind w:firstLine="567"/>
+        <w:jc w:val="both"/>
+      </w:pPr>
+      <w:r>
+        <w:rPr>
+          <w:rFonts w:ascii="Times New Roman" w:cs="Times New Roman" w:eastAsia="Times New Roman" w:hAnsi="Times New Roman"/>
+          <w:sz w:val="28"/>
+          <w:szCs w:val="28"/>
+        </w:rPr>
+        <w:t xml:space="preserve">Darslikka ko'ra, dunyoda birinchi epidemiologiya kafedrasi 1920-yilda Odessada D.K. Zabolotniy tomonidan ochilgan; L.V. Gromashevskiy epidemik jarayon va yuqish mexanizmi haqidagi ta'limotni yaratgan, E.N. Pavlovskiy tabiiy o'choqlilik nazariyasini ishlab chiqqan, V.D. Belyakov esa epidemik jarayonning o'z-o'zini boshqarish nazariyasini asoslagan [1]. 1930–1940-yillarda epidemiologiya usullari yuqumli bo'lmagan kasalliklarga ham tatbiq etila boshlandi; 1960–1970-yillarda chechakning butun dunyoda tugatilishi amaliy epidemiologiyaning misli ko'rilmagan yutug'i sifatida baholanadi [3].</w:t>
+      </w:r>
+    </w:p>
+    <w:p>
+      <w:pPr>
+        <w:spacing w:after="120" w:line="276"/>
+        <w:ind w:firstLine="567"/>
+        <w:jc w:val="both"/>
+      </w:pPr>
+      <w:r>
+        <w:rPr>
+          <w:rFonts w:ascii="Times New Roman" w:cs="Times New Roman" w:eastAsia="Times New Roman" w:hAnsi="Times New Roman"/>
+          <w:sz w:val="28"/>
+          <w:szCs w:val="28"/>
+        </w:rPr>
+        <w:t xml:space="preserve">O'zbekistonda mustaqil epidemiologiya kafedrasi 1935-yilda Toshkent davlat tibbiyot instituti tarkibida tashkil topgan; 1930–1935-yillarda fan mikrobiologiya va yuqumli kasalliklar kafedralari qoshida kurs sifatida o'qitilgan. Kafedraga professorlar A.V. Georgiyevskiy (1935–1952), M.N. Soshnikova (1954–1972), M.Q. Usmonov (1972–1993), O.M. Mirtazayev (1993–2010) va boshqalar rahbarlik qilgan [1]. Darslikda ta'kidlanishicha, o'zbekistonlik olimlarning ilmiy ishlari natijasida chechak, rishta va poliomielit aholi orasida tugatilgan, ammo o'tkir ichak infeksiyalari, gripp va O'RK, virusli gepatitlar, ayrim tabiiy o'choqli kasalliklar hamda OIV-infeksiyasi dolzarb muammo bo'lib qolmoqda [1].</w:t>
+      </w:r>
+    </w:p>
+    <w:p>
+      <w:pPr>
+        <w:pStyle w:val="Heading2"/>
+        <w:spacing w:after="100" w:before="200"/>
+      </w:pPr>
+      <w:r>
+        <w:rPr>
+          <w:rFonts w:ascii="Times New Roman" w:cs="Times New Roman" w:eastAsia="Times New Roman" w:hAnsi="Times New Roman"/>
+          <w:b/>
+          <w:bCs/>
+          <w:sz w:val="28"/>
+          <w:szCs w:val="28"/>
+        </w:rPr>
+        <w:t xml:space="preserve">Fanning zamonaviy mazmuni</w:t>
+      </w:r>
+    </w:p>
+    <w:p>
+      <w:pPr>
+        <w:spacing w:after="120" w:line="276"/>
+        <w:ind w:firstLine="567"/>
+        <w:jc w:val="both"/>
+      </w:pPr>
+      <w:r>
+        <w:rPr>
+          <w:rFonts w:ascii="Times New Roman" w:cs="Times New Roman" w:eastAsia="Times New Roman" w:hAnsi="Times New Roman"/>
+          <w:sz w:val="28"/>
+          <w:szCs w:val="28"/>
+        </w:rPr>
+        <w:t xml:space="preserve">Darslikda ta'kidlanishicha, dastlab epidemiyalar haqidagi, ya'ni yuqumli kasalliklarning ommaviy tarqalishi to'g'risidagi fan sifatida shakllangan epidemiologiya asta-sekin epidemik jarayon haqidagi fanga aylandi [1]. Gippokrat davrida "epidemiya" so'zi odamlar orasida tarqalgan yuqumli va yuqumli bo'lmagan ommaviy kasalliklarni qamrab olgan [1]. Hozirgi epidemiologiya esa, masalan retrospektiv tahlil doirasida, xavf guruhlarini, hududlarini va xavf vaqtini aniqlaydi hamda o'tkazilgan chora-tadbirlar samaradorligini baholaydi [1].</w:t>
+      </w:r>
+    </w:p>
+    <w:p>
+      <w:pPr>
+        <w:spacing w:after="120" w:line="276"/>
+        <w:ind w:firstLine="567"/>
+        <w:jc w:val="both"/>
+      </w:pPr>
+      <w:r>
+        <w:rPr>
+          <w:rFonts w:ascii="Times New Roman" w:cs="Times New Roman" w:eastAsia="Times New Roman" w:hAnsi="Times New Roman"/>
+          <w:sz w:val="28"/>
+          <w:szCs w:val="28"/>
+        </w:rPr>
+        <w:t xml:space="preserve">XX asrning oxirlarida molekulyar va genetik epidemiologiya shakllandi: u kasallik xavfiga ta'sir qiluvchi aniq yo'llar, molekulalar va genlarni o'rganadi. Shu bilan birga yangi yuqumli omillar (Ebola virusi, OIV/OITS) paydo bo'ldi, ba'zilari aniqlandi (Legionella, SARS), ayrimlari o'zgardi (dori-darmonga chidamli sil mikobakteriyasi, qush grippi); 1990-yillardan boshlab epidemiologlar yuqumli qo'zg'atuvchilarning tabiiy tarqalishi bilan birga ularning biologik qurol sifatida ataylab tarqatilishini ham hisobga olishga majbur bo'ldi [3]. Tibbiyot oliygohi bitiruvchisi uchun bu tarixiy xulosa amaliy ahamiyatga ega: hozirgi vrach-epidemiolog bir vaqtning o'zida klassik kuzatuv usullarini ham, zamonaviy laboratoriya va axborot vositalarini ham qo'llay olishi kerak.</w:t>
+      </w:r>
+    </w:p>
+    <w:p>
+      <w:pPr>
+        <w:pStyle w:val="Heading2"/>
+        <w:spacing w:after="100" w:before="200"/>
+      </w:pPr>
+      <w:r>
+        <w:rPr>
+          <w:rFonts w:ascii="Times New Roman" w:cs="Times New Roman" w:eastAsia="Times New Roman" w:hAnsi="Times New Roman"/>
+          <w:b/>
+          <w:bCs/>
+          <w:sz w:val="28"/>
+          <w:szCs w:val="28"/>
+        </w:rPr>
+        <w:t xml:space="preserve">Xulosa</w:t>
+      </w:r>
+    </w:p>
+    <w:p>
+      <w:pPr>
+        <w:spacing w:after="120" w:line="276"/>
+        <w:ind w:firstLine="567"/>
+        <w:jc w:val="both"/>
+      </w:pPr>
+      <w:r>
+        <w:rPr>
+          <w:rFonts w:ascii="Times New Roman" w:cs="Times New Roman" w:eastAsia="Times New Roman" w:hAnsi="Times New Roman"/>
+          <w:sz w:val="28"/>
+          <w:szCs w:val="28"/>
+        </w:rPr>
+        <w:t xml:space="preserve">Epidemiologiya Gippokrat davridagi kuzatuvlardan Snouning dala tadqiqotlariga, Pasterning mikrobiologik kashfiyotlaridan zamonaviy molekulyar va jamoat salomatligi yondashuvlarigacha rivojlandi. Uning mohiyati o'zgarmagan: kasallik tarqalishini tavsiflash, sabablarni aniqlash va aniq asoslangan nazorat choralarini qo'llash. Shuning uchun vrach-epidemiolog ham tarixiy tajribani, ham O'zbekistonning bugungi epidemiologik vaziyatini bilishi lozim.</w:t>
+      </w:r>
+    </w:p>
+    <w:p>
+      <w:pPr>
+        <w:pStyle w:val="Heading2"/>
+        <w:spacing w:after="100" w:before="280"/>
+      </w:pPr>
+      <w:r>
+        <w:rPr>
+          <w:rFonts w:ascii="Times New Roman" w:cs="Times New Roman" w:eastAsia="Times New Roman" w:hAnsi="Times New Roman"/>
+          <w:b/>
+          <w:bCs/>
+          <w:sz w:val="28"/>
+          <w:szCs w:val="28"/>
+        </w:rPr>
+        <w:t xml:space="preserve">Foydalanilgan adabiyotlar</w:t>
+      </w:r>
+    </w:p>
+    <w:p>
+      <w:pPr>
+        <w:pStyle w:val="ListParagraph"/>
+        <w:numPr>
+          <w:ilvl w:val="0"/>
+          <w:numId w:val="4"/>
+        </w:numPr>
+        <w:spacing w:after="80" w:line="260"/>
+      </w:pPr>
+      <w:r>
+        <w:rPr>
+          <w:rFonts w:ascii="Times New Roman" w:cs="Times New Roman" w:eastAsia="Times New Roman" w:hAnsi="Times New Roman"/>
+          <w:sz w:val="28"/>
+          <w:szCs w:val="28"/>
+        </w:rPr>
+        <w:t xml:space="preserve">Mirtazayev O.M., Zueva L.P., Matnazarova G.S. Epidemiologiya (darslik). Toshkent, 2016. I bob: Epidemiologiyaning ta'rifi va qisqacha tarixi, 7–12-betlar. Manba: xayrullokomilov.uz/kutubxona, material № 2356 (matn kirill yozuvida).</w:t>
+      </w:r>
+    </w:p>
+    <w:p>
+      <w:pPr>
+        <w:pStyle w:val="ListParagraph"/>
+        <w:numPr>
+          <w:ilvl w:val="0"/>
+          <w:numId w:val="4"/>
+        </w:numPr>
+        <w:spacing w:after="80" w:line="260"/>
+      </w:pPr>
+      <w:r>
+        <w:rPr>
+          <w:rFonts w:ascii="Times New Roman" w:cs="Times New Roman" w:eastAsia="Times New Roman" w:hAnsi="Times New Roman"/>
+          <w:sz w:val="28"/>
+          <w:szCs w:val="28"/>
+        </w:rPr>
+        <w:t xml:space="preserve">Centers for Disease Control and Prevention (CDC). Principles of Epidemiology in Public Health Practice (SS1978), Lesson 1, Section 1: Definition of Epidemiology. URL: https://archive.cdc.gov/www_cdc_gov/csels/dsepd/ss1978/lesson1/section1.html (kirilgan sana: 30.10.2026).</w:t>
+      </w:r>
+    </w:p>
+    <w:p>
+      <w:pPr>
+        <w:pStyle w:val="ListParagraph"/>
+        <w:numPr>
+          <w:ilvl w:val="0"/>
+          <w:numId w:val="4"/>
+        </w:numPr>
+        <w:spacing w:after="80" w:line="260"/>
+      </w:pPr>
+      <w:r>
+        <w:rPr>
+          <w:rFonts w:ascii="Times New Roman" w:cs="Times New Roman" w:eastAsia="Times New Roman" w:hAnsi="Times New Roman"/>
+          <w:sz w:val="28"/>
+          <w:szCs w:val="28"/>
+        </w:rPr>
+        <w:t xml:space="preserve">CDC. Principles of Epidemiology in Public Health Practice (SS1978), Lesson 1, Section 2: Historical Evolution of Epidemiology. URL: https://archive.cdc.gov/www_cdc_gov/csels/dsepd/ss1978/lesson1/section2.html (kirilgan sana: 30.10.2026).</w:t>
       </w:r>
     </w:p>
     <w:sectPr>
       <w:pgSz w:w="11906" w:h="16838" w:orient="portrait"/>
-      <w:pgMar w:top="1134" w:right="850" w:bottom="1134" w:left="1418" w:header="708" w:footer="708" w:gutter="0"/>
+      <w:pgMar w:top="1134" w:right="850" w:bottom="1134" w:left="1701" w:header="708" w:footer="708" w:gutter="0"/>
       <w:pgNumType/>
       <w:docGrid w:linePitch="360"/>
     </w:sectPr>
@@ -368,12 +741,17 @@
     <w:multiLevelType w:val="hybridMultilevel"/>
     <w:lvl w:ilvl="0" w:tentative="1">
       <w:start w:val="1"/>
-      <w:numFmt w:val="bullet"/>
-      <w:lvlText w:val="•"/>
+      <w:numFmt w:val="decimal"/>
+      <w:lvlText w:val="[%1]"/>
       <w:lvlJc w:val="left"/>
       <w:pPr>
-        <w:ind w:left="576" w:hanging="316"/>
-      </w:pPr>
+        <w:ind w:left="720" w:hanging="720"/>
+      </w:pPr>
+      <w:rPr>
+        <w:rFonts w:ascii="Times New Roman" w:cs="Times New Roman" w:eastAsia="Times New Roman" w:hAnsi="Times New Roman"/>
+        <w:sz w:val="28"/>
+        <w:szCs w:val="28"/>
+      </w:rPr>
     </w:lvl>
   </w:abstractNum>
   <w:abstractNum w:abstractNumId="3" w15:restartNumberingAfterBreak="0">
@@ -381,11 +759,16 @@
     <w:lvl w:ilvl="0" w:tentative="1">
       <w:start w:val="1"/>
       <w:numFmt w:val="decimal"/>
-      <w:lvlText w:val="%1."/>
+      <w:lvlText w:val="%1)"/>
       <w:lvlJc w:val="left"/>
       <w:pPr>
-        <w:ind w:left="576" w:hanging="316"/>
-      </w:pPr>
+        <w:ind w:left="851" w:hanging="425"/>
+      </w:pPr>
+      <w:rPr>
+        <w:rFonts w:ascii="Times New Roman" w:cs="Times New Roman" w:eastAsia="Times New Roman" w:hAnsi="Times New Roman"/>
+        <w:sz w:val="28"/>
+        <w:szCs w:val="28"/>
+      </w:rPr>
     </w:lvl>
   </w:abstractNum>
   <w:abstractNum w:abstractNumId="4" w15:restartNumberingAfterBreak="0">
@@ -393,11 +776,16 @@
     <w:lvl w:ilvl="0" w:tentative="1">
       <w:start w:val="1"/>
       <w:numFmt w:val="decimal"/>
-      <w:lvlText w:val="%1."/>
+      <w:lvlText w:val="%1)"/>
       <w:lvlJc w:val="left"/>
       <w:pPr>
-        <w:ind w:left="576" w:hanging="316"/>
-      </w:pPr>
+        <w:ind w:left="851" w:hanging="425"/>
+      </w:pPr>
+      <w:rPr>
+        <w:rFonts w:ascii="Times New Roman" w:cs="Times New Roman" w:eastAsia="Times New Roman" w:hAnsi="Times New Roman"/>
+        <w:sz w:val="28"/>
+        <w:szCs w:val="28"/>
+      </w:rPr>
     </w:lvl>
   </w:abstractNum>
   <w:num w:numId="1">
@@ -407,7 +795,19 @@
     </w:lvlOverride>
   </w:num>
   <w:num w:numId="2">
+    <w:abstractNumId w:val="3"/>
+    <w:lvlOverride w:ilvl="0">
+      <w:startOverride w:val="1"/>
+    </w:lvlOverride>
+  </w:num>
+  <w:num w:numId="3">
     <w:abstractNumId w:val="4"/>
+    <w:lvlOverride w:ilvl="0">
+      <w:startOverride w:val="1"/>
+    </w:lvlOverride>
+  </w:num>
+  <w:num w:numId="4">
+    <w:abstractNumId w:val="2"/>
     <w:lvlOverride w:ilvl="0">
       <w:startOverride w:val="1"/>
     </w:lvlOverride>
@@ -421,8 +821,8 @@
     <w:rPrDefault>
       <w:rPr>
         <w:rFonts w:ascii="Times New Roman" w:cs="Times New Roman" w:eastAsia="Times New Roman" w:hAnsi="Times New Roman"/>
-        <w:sz w:val="24"/>
-        <w:szCs w:val="24"/>
+        <w:sz w:val="28"/>
+        <w:szCs w:val="28"/>
       </w:rPr>
     </w:rPrDefault>
     <w:pPrDefault/>
@@ -557,7 +957,7 @@
     <w:unhideWhenUsed/>
     <w:pPr>
       <w:spacing w:after="100"/>
-      <w:ind w:left="240"/>
+      <w:ind w:left="280"/>
     </w:pPr>
   </w:style>
   <w:style w:type="paragraph" w:styleId="TOC3">
@@ -569,7 +969,7 @@
     <w:unhideWhenUsed/>
     <w:pPr>
       <w:spacing w:after="100"/>
-      <w:ind w:left="480"/>
+      <w:ind w:left="560"/>
     </w:pPr>
   </w:style>
   <w:style w:type="paragraph" w:styleId="TOC4">
@@ -581,7 +981,7 @@
     <w:unhideWhenUsed/>
     <w:pPr>
       <w:spacing w:after="100"/>
-      <w:ind w:left="720"/>
+      <w:ind w:left="840"/>
     </w:pPr>
   </w:style>
   <w:style w:type="paragraph" w:styleId="TOC5">
@@ -593,7 +993,7 @@
     <w:unhideWhenUsed/>
     <w:pPr>
       <w:spacing w:after="100"/>
-      <w:ind w:left="960"/>
+      <w:ind w:left="1120"/>
     </w:pPr>
   </w:style>
   <w:style w:type="paragraph" w:styleId="TOC6">
@@ -605,23 +1005,11 @@
     <w:unhideWhenUsed/>
     <w:pPr>
       <w:spacing w:after="100"/>
-      <w:ind w:left="1200"/>
+      <w:ind w:left="1400"/>
     </w:pPr>
   </w:style>
   <w:style w:type="paragraph" w:styleId="TOC7">
     <w:name w:val="toc 7"/>
-    <w:basedOn w:val="Normal"/>
-    <w:next w:val="Normal"/>
-    <w:uiPriority w:val="39"/>
-    <w:semiHidden/>
-    <w:unhideWhenUsed/>
-    <w:pPr>
-      <w:spacing w:after="100"/>
-      <w:ind w:left="1440"/>
-    </w:pPr>
-  </w:style>
-  <w:style w:type="paragraph" w:styleId="TOC8">
-    <w:name w:val="toc 8"/>
     <w:basedOn w:val="Normal"/>
     <w:next w:val="Normal"/>
     <w:uiPriority w:val="39"/>
@@ -632,6 +1020,18 @@
       <w:ind w:left="1680"/>
     </w:pPr>
   </w:style>
+  <w:style w:type="paragraph" w:styleId="TOC8">
+    <w:name w:val="toc 8"/>
+    <w:basedOn w:val="Normal"/>
+    <w:next w:val="Normal"/>
+    <w:uiPriority w:val="39"/>
+    <w:semiHidden/>
+    <w:unhideWhenUsed/>
+    <w:pPr>
+      <w:spacing w:after="100"/>
+      <w:ind w:left="1960"/>
+    </w:pPr>
+  </w:style>
   <w:style w:type="paragraph" w:styleId="TOC9">
     <w:name w:val="toc 9"/>
     <w:basedOn w:val="Normal"/>
@@ -641,7 +1041,7 @@
     <w:unhideWhenUsed/>
     <w:pPr>
       <w:spacing w:after="100"/>
-      <w:ind w:left="1920"/>
+      <w:ind w:left="2240"/>
     </w:pPr>
   </w:style>
   <w:style w:type="character" w:styleId="Hyperlink">
@@ -741,15 +1141,16 @@
     <w:next w:val="Normal"/>
     <w:qFormat/>
     <w:pPr>
-      <w:spacing w:after="200"/>
-      <w:jc w:val="center"/>
+      <w:spacing w:after="240" w:before="0"/>
+      <w:outlineLvl w:val="0"/>
     </w:pPr>
     <w:rPr>
       <w:rFonts w:ascii="Times New Roman" w:cs="Times New Roman" w:eastAsia="Times New Roman" w:hAnsi="Times New Roman"/>
       <w:b/>
       <w:bCs/>
-      <w:sz w:val="28"/>
-      <w:szCs w:val="28"/>
+      <w:color w:val="000000"/>
+      <w:sz w:val="30"/>
+      <w:szCs w:val="30"/>
     </w:rPr>
   </w:style>
   <w:style w:type="paragraph" w:styleId="Heading2">
@@ -757,12 +1158,17 @@
     <w:basedOn w:val="Normal"/>
     <w:next w:val="Normal"/>
     <w:qFormat/>
+    <w:pPr>
+      <w:spacing w:after="100" w:before="200"/>
+      <w:outlineLvl w:val="1"/>
+    </w:pPr>
     <w:rPr>
       <w:rFonts w:ascii="Times New Roman" w:cs="Times New Roman" w:eastAsia="Times New Roman" w:hAnsi="Times New Roman"/>
       <w:b/>
       <w:bCs/>
-      <w:sz w:val="26"/>
-      <w:szCs w:val="26"/>
+      <w:color w:val="000000"/>
+      <w:sz w:val="28"/>
+      <w:szCs w:val="28"/>
     </w:rPr>
   </w:style>
 </w:styles>

</xml_diff>

<commit_message>
001-008 manbalari 5 tagacha kengaytirildi; hisobot yangilandi
</commit_message>
<xml_diff>
--- a/javoblar/001.docx
+++ b/javoblar/001.docx
@@ -494,7 +494,7 @@
           <w:sz w:val="28"/>
           <w:szCs w:val="28"/>
         </w:rPr>
-        <w:t xml:space="preserve">Epidemiologiya Gippokrat davridagi kuzatuvlardan Snouning dala tadqiqotlariga, Pasterning mikrobiologik kashfiyotlaridan zamonaviy molekulyar va jamoat salomatligi yondashuvlarigacha rivojlandi. Uning mohiyati o'zgarmagan: kasallik tarqalishini tavsiflash, sabablarni aniqlash va aniq asoslangan nazorat choralarini qo'llash. Shuning uchun vrach-epidemiolog ham tarixiy tajribani, ham O'zbekistonning bugungi epidemiologik vaziyatini bilishi lozim.</w:t>
+        <w:t xml:space="preserve">Epidemiologiya Gippokrat davridagi kuzatuvlardan Snouning dala tadqiqotlariga, Pasterning mikrobiologik kashfiyotlaridan zamonaviy molekulyar va jamoat salomatligi yondashuvlarigacha rivojlandi. Uning mohiyati o'zgarmagan: kasallik tarqalishini tavsiflash, sabablarni aniqlash va aniq asoslangan nazorat choralarini qo'llash. Shuning uchun vrach-epidemiolog ham tarixiy tajribani, ham O'zbekistonning bugungi epidemiologik vaziyatini bilishi lozim. O'zbekistonda sanitariya-epidemiologiya xizmati tarixi alohida monografiyada yoritilgan; masalan, 1955-yil 20-avgustda respublika, viloyat va o'lka stansiyalari qoshida o'ta xavfli infeksiyalar bo'limlari to'g'risidagi nizom tasdiqlangan [4]. Xizmatning tashkiliy asoslari tarixida 1918-yil 11-iyulda Xalq Komissarlari Soveti "Sog'liqni saqlash xalq komissarligini tashkil etish to'g'risida"gi dekretni qabul qilgani va N.A. Semashko birinchi xalq komissari etib tayinlangani qayd etiladi [5].</w:t>
       </w:r>
     </w:p>
     <w:p>
@@ -565,6 +565,42 @@
           <w:szCs w:val="28"/>
         </w:rPr>
         <w:t xml:space="preserve">CDC. Principles of Epidemiology in Public Health Practice (SS1978), Lesson 1, Section 2: Historical Evolution of Epidemiology. URL: https://archive.cdc.gov/www_cdc_gov/csels/dsepd/ss1978/lesson1/section2.html (kirilgan sana: 30.10.2026).</w:t>
+      </w:r>
+    </w:p>
+    <w:p>
+      <w:pPr>
+        <w:pStyle w:val="ListParagraph"/>
+        <w:numPr>
+          <w:ilvl w:val="0"/>
+          <w:numId w:val="4"/>
+        </w:numPr>
+        <w:spacing w:after="80" w:line="260"/>
+      </w:pPr>
+      <w:r>
+        <w:rPr>
+          <w:rFonts w:ascii="Times New Roman" w:cs="Times New Roman" w:eastAsia="Times New Roman" w:hAnsi="Times New Roman"/>
+          <w:sz w:val="28"/>
+          <w:szCs w:val="28"/>
+        </w:rPr>
+        <w:t xml:space="preserve">Niyazmatov B.I., Kudasheva L.V., Shoumarov S.B., Mustafaev Kh.M. Istoriya organizatsii i razvitiya sanitarno-epidemiologicheskoy sluzhby v Respublike Uzbekistan. Tashkent: Uzbekistan, 2008. 304 s. ISBN 978-9943-01-354-4 (rus tilida). Manba: xayrullokomilov.uz/kutubxona, material № 2359.</w:t>
+      </w:r>
+    </w:p>
+    <w:p>
+      <w:pPr>
+        <w:pStyle w:val="ListParagraph"/>
+        <w:numPr>
+          <w:ilvl w:val="0"/>
+          <w:numId w:val="4"/>
+        </w:numPr>
+        <w:spacing w:after="80" w:line="260"/>
+      </w:pPr>
+      <w:r>
+        <w:rPr>
+          <w:rFonts w:ascii="Times New Roman" w:cs="Times New Roman" w:eastAsia="Times New Roman" w:hAnsi="Times New Roman"/>
+          <w:sz w:val="28"/>
+          <w:szCs w:val="28"/>
+        </w:rPr>
+        <w:t xml:space="preserve">Komilov X. Sanitariya-epidemiologiya xizmati qisqacha tarixi (maqola, 20.06.2025). Manba: xayrullokomilov.uz/kutubxona, material № 2288 (matn kirill yozuvida).</w:t>
       </w:r>
     </w:p>
     <w:sectPr>

</xml_diff>